<commit_message>
Revise Lab 4 report for school style and human direction
</commit_message>
<xml_diff>
--- a/output/CGT390_Lab4_SEO_GEO_Page_Audit.docx
+++ b/output/CGT390_Lab4_SEO_GEO_Page_Audit.docx
@@ -145,7 +145,7 @@
               <w:insideH w:val="single" w:sz="4" w:space="0" w:color="D9D9D9"/>
               <w:insideV w:val="single" w:sz="4" w:space="0" w:color="D9D9D9"/>
             </w:tcBorders>
-            <w:shd w:fill="44546A"/>
+            <w:shd w:fill="E7E6E6"/>
           </w:tcPr>
           <w:p>
             <w:pPr>
@@ -154,7 +154,7 @@
             <w:r>
               <w:rPr>
                 <w:b/>
-                <w:color w:val="FFFFFF"/>
+                <w:color w:val="000000"/>
                 <w:sz w:val="17"/>
               </w:rPr>
               <w:t>Lens</w:t>
@@ -173,7 +173,7 @@
               <w:insideH w:val="single" w:sz="4" w:space="0" w:color="D9D9D9"/>
               <w:insideV w:val="single" w:sz="4" w:space="0" w:color="D9D9D9"/>
             </w:tcBorders>
-            <w:shd w:fill="44546A"/>
+            <w:shd w:fill="E7E6E6"/>
           </w:tcPr>
           <w:p>
             <w:pPr>
@@ -182,7 +182,7 @@
             <w:r>
               <w:rPr>
                 <w:b/>
-                <w:color w:val="FFFFFF"/>
+                <w:color w:val="000000"/>
                 <w:sz w:val="17"/>
               </w:rPr>
               <w:t>Evidence</w:t>
@@ -201,7 +201,7 @@
               <w:insideH w:val="single" w:sz="4" w:space="0" w:color="D9D9D9"/>
               <w:insideV w:val="single" w:sz="4" w:space="0" w:color="D9D9D9"/>
             </w:tcBorders>
-            <w:shd w:fill="44546A"/>
+            <w:shd w:fill="E7E6E6"/>
           </w:tcPr>
           <w:p>
             <w:pPr>
@@ -210,7 +210,7 @@
             <w:r>
               <w:rPr>
                 <w:b/>
-                <w:color w:val="FFFFFF"/>
+                <w:color w:val="000000"/>
                 <w:sz w:val="17"/>
               </w:rPr>
               <w:t>Interpretation</w:t>
@@ -883,7 +883,7 @@
       </w:r>
       <w:r>
         <w:rPr>
-          <w:rFonts w:ascii="Consolas" w:hAnsi="Consolas"/>
+          <w:rFonts w:ascii="Times New Roman" w:hAnsi="Times New Roman"/>
           <w:sz w:val="18"/>
         </w:rPr>
         <w:t>rel="canonical"</w:t>
@@ -893,7 +893,7 @@
       </w:r>
       <w:r>
         <w:rPr>
-          <w:rFonts w:ascii="Consolas" w:hAnsi="Consolas"/>
+          <w:rFonts w:ascii="Times New Roman" w:hAnsi="Times New Roman"/>
           <w:sz w:val="18"/>
         </w:rPr>
         <w:t>CollectionPage</w:t>
@@ -1049,7 +1049,7 @@
               <w:insideH w:val="single" w:sz="4" w:space="0" w:color="D9D9D9"/>
               <w:insideV w:val="single" w:sz="4" w:space="0" w:color="D9D9D9"/>
             </w:tcBorders>
-            <w:shd w:fill="44546A"/>
+            <w:shd w:fill="E7E6E6"/>
           </w:tcPr>
           <w:p>
             <w:pPr>
@@ -1058,7 +1058,7 @@
             <w:r>
               <w:rPr>
                 <w:b/>
-                <w:color w:val="FFFFFF"/>
+                <w:color w:val="000000"/>
                 <w:sz w:val="17"/>
               </w:rPr>
               <w:t>Claim checked</w:t>
@@ -1077,7 +1077,7 @@
               <w:insideH w:val="single" w:sz="4" w:space="0" w:color="D9D9D9"/>
               <w:insideV w:val="single" w:sz="4" w:space="0" w:color="D9D9D9"/>
             </w:tcBorders>
-            <w:shd w:fill="44546A"/>
+            <w:shd w:fill="E7E6E6"/>
           </w:tcPr>
           <w:p>
             <w:pPr>
@@ -1086,7 +1086,7 @@
             <w:r>
               <w:rPr>
                 <w:b/>
-                <w:color w:val="FFFFFF"/>
+                <w:color w:val="000000"/>
                 <w:sz w:val="17"/>
               </w:rPr>
               <w:t>Supporting page evidence</w:t>
@@ -1105,7 +1105,7 @@
               <w:insideH w:val="single" w:sz="4" w:space="0" w:color="D9D9D9"/>
               <w:insideV w:val="single" w:sz="4" w:space="0" w:color="D9D9D9"/>
             </w:tcBorders>
-            <w:shd w:fill="44546A"/>
+            <w:shd w:fill="E7E6E6"/>
           </w:tcPr>
           <w:p>
             <w:pPr>
@@ -1114,7 +1114,7 @@
             <w:r>
               <w:rPr>
                 <w:b/>
-                <w:color w:val="FFFFFF"/>
+                <w:color w:val="000000"/>
                 <w:sz w:val="17"/>
               </w:rPr>
               <w:t>Classification</w:t>
@@ -1521,7 +1521,12 @@
     </w:p>
     <w:p>
       <w:r>
-        <w:t>AI assisted with identifying audit evidence, drafting the findings, proposing metadata and structured-data improvements, editing the Explore page, checking the deployed page, and organizing this report. Human direction defined the Gatherly scope, selected the Explore page and likely query, kept the events fictional, and reviewed the recommendations and implementation.</w:t>
+        <w:t>AI supported this lab as a research, writing, and implementation assistant. It helped identify audit evidence in the existing Gatherly files, organize the findings, suggest clearer metadata and structured-data improvements, update the Explore page, and check the deployed page after the changes were published. It also helped organize the evidence and validation results into this report.</w:t>
+      </w:r>
+    </w:p>
+    <w:p>
+      <w:r>
+        <w:t>Human direction remained responsible for the important decisions. I selected Gatherly as the case-study prototype, chose the Explore Events page, defined the intended user and likely search query, and decided which user task the audit should prioritize. I reviewed the suggested changes and limited the implementation to two improvements that fit the page: clearer search intent and stronger page identity. I also chose to keep the event data fictional, avoided claiming real availability or rankings, and rejected unsupported SEO additions. After implementation, I reviewed the deployed page, confirmed that the title, H1, metadata, canonical URL, and structured data matched the visible content, and tested the event search behavior. The AI helped carry out and document these steps, but the scope, judgment, fact-checking, and final decisions remained human-directed.</w:t>
       </w:r>
     </w:p>
     <w:p>
@@ -1932,7 +1937,7 @@
       <w:spacing w:after="120"/>
     </w:pPr>
     <w:rPr>
-      <w:rFonts w:ascii="Aptos" w:hAnsi="Aptos"/>
+      <w:rFonts w:ascii="Times New Roman" w:hAnsi="Times New Roman"/>
       <w:sz w:val="21"/>
     </w:rPr>
   </w:style>
@@ -1995,7 +2000,7 @@
       <w:outlineLvl w:val="0"/>
     </w:pPr>
     <w:rPr>
-      <w:rFonts w:asciiTheme="majorHAnsi" w:eastAsiaTheme="majorEastAsia" w:hAnsiTheme="majorHAnsi" w:cstheme="majorBidi" w:ascii="Aptos Display" w:hAnsi="Aptos Display"/>
+      <w:rFonts w:asciiTheme="majorHAnsi" w:eastAsiaTheme="majorEastAsia" w:hAnsiTheme="majorHAnsi" w:cstheme="majorBidi" w:ascii="Times New Roman" w:hAnsi="Times New Roman"/>
       <w:b/>
       <w:bCs/>
       <w:color w:val="000000"/>
@@ -2019,7 +2024,7 @@
       <w:outlineLvl w:val="1"/>
     </w:pPr>
     <w:rPr>
-      <w:rFonts w:asciiTheme="majorHAnsi" w:eastAsiaTheme="majorEastAsia" w:hAnsiTheme="majorHAnsi" w:cstheme="majorBidi" w:ascii="Aptos Display" w:hAnsi="Aptos Display"/>
+      <w:rFonts w:asciiTheme="majorHAnsi" w:eastAsiaTheme="majorEastAsia" w:hAnsiTheme="majorHAnsi" w:cstheme="majorBidi" w:ascii="Times New Roman" w:hAnsi="Times New Roman"/>
       <w:b/>
       <w:bCs/>
       <w:color w:val="000000"/>
@@ -2043,7 +2048,7 @@
       <w:outlineLvl w:val="2"/>
     </w:pPr>
     <w:rPr>
-      <w:rFonts w:asciiTheme="majorHAnsi" w:eastAsiaTheme="majorEastAsia" w:hAnsiTheme="majorHAnsi" w:cstheme="majorBidi" w:ascii="Aptos Display" w:hAnsi="Aptos Display"/>
+      <w:rFonts w:asciiTheme="majorHAnsi" w:eastAsiaTheme="majorEastAsia" w:hAnsiTheme="majorHAnsi" w:cstheme="majorBidi" w:ascii="Times New Roman" w:hAnsi="Times New Roman"/>
       <w:b/>
       <w:bCs/>
       <w:color w:val="000000"/>
@@ -2285,7 +2290,7 @@
       <w:contextualSpacing/>
     </w:pPr>
     <w:rPr>
-      <w:rFonts w:asciiTheme="majorHAnsi" w:eastAsiaTheme="majorEastAsia" w:hAnsiTheme="majorHAnsi" w:cstheme="majorBidi" w:ascii="Aptos Display" w:hAnsi="Aptos Display"/>
+      <w:rFonts w:asciiTheme="majorHAnsi" w:eastAsiaTheme="majorEastAsia" w:hAnsiTheme="majorHAnsi" w:cstheme="majorBidi" w:ascii="Times New Roman" w:hAnsi="Times New Roman"/>
       <w:b/>
       <w:color w:val="000000"/>
       <w:spacing w:val="5"/>

</xml_diff>

<commit_message>
Reduce report emphasis and color
</commit_message>
<xml_diff>
--- a/output/CGT390_Lab4_SEO_GEO_Page_Audit.docx
+++ b/output/CGT390_Lab4_SEO_GEO_Page_Audit.docx
@@ -24,9 +24,6 @@
         <w:pStyle w:val="ListBullet"/>
       </w:pPr>
       <w:r>
-        <w:rPr>
-          <w:b/>
-        </w:rPr>
         <w:t>Selected page:</w:t>
       </w:r>
       <w:r>
@@ -38,9 +35,6 @@
         <w:pStyle w:val="ListBullet"/>
       </w:pPr>
       <w:r>
-        <w:rPr>
-          <w:b/>
-        </w:rPr>
         <w:t>URL:</w:t>
       </w:r>
       <w:r>
@@ -52,9 +46,6 @@
         <w:pStyle w:val="ListBullet"/>
       </w:pPr>
       <w:r>
-        <w:rPr>
-          <w:b/>
-        </w:rPr>
         <w:t>Intended user:</w:t>
       </w:r>
       <w:r>
@@ -66,9 +57,6 @@
         <w:pStyle w:val="ListBullet"/>
       </w:pPr>
       <w:r>
-        <w:rPr>
-          <w:b/>
-        </w:rPr>
         <w:t>Important task:</w:t>
       </w:r>
       <w:r>
@@ -80,9 +68,6 @@
         <w:pStyle w:val="ListBullet"/>
       </w:pPr>
       <w:r>
-        <w:rPr>
-          <w:b/>
-        </w:rPr>
         <w:t>Likely search query:</w:t>
       </w:r>
       <w:r>
@@ -94,18 +79,12 @@
         <w:t xml:space="preserve">This page helps </w:t>
       </w:r>
       <w:r>
-        <w:rPr>
-          <w:b/>
-        </w:rPr>
         <w:t>people looking for a beginner-friendly activity</w:t>
       </w:r>
       <w:r>
         <w:t xml:space="preserve"> when they search for </w:t>
       </w:r>
       <w:r>
-        <w:rPr>
-          <w:b/>
-        </w:rPr>
         <w:t>creative workshops and local events</w:t>
       </w:r>
       <w:r>
@@ -710,9 +689,6 @@
         <w:pStyle w:val="ListNumber"/>
       </w:pPr>
       <w:r>
-        <w:rPr>
-          <w:b/>
-        </w:rPr>
         <w:t>Can a searcher and search system understand that this page is a collection of creative workshops and local events?</w:t>
       </w:r>
     </w:p>
@@ -721,9 +697,6 @@
         <w:pStyle w:val="ListNumber"/>
       </w:pPr>
       <w:r>
-        <w:rPr>
-          <w:b/>
-        </w:rPr>
         <w:t>Can a search or generative system identify the page as the authoritative source for the event facts shown to the user?</w:t>
       </w:r>
     </w:p>
@@ -753,9 +726,6 @@
         <w:pStyle w:val="ListBullet"/>
       </w:pPr>
       <w:r>
-        <w:rPr>
-          <w:b/>
-        </w:rPr>
         <w:t>Evidence:</w:t>
       </w:r>
       <w:r>
@@ -767,9 +737,6 @@
         <w:pStyle w:val="ListBullet"/>
       </w:pPr>
       <w:r>
-        <w:rPr>
-          <w:b/>
-        </w:rPr>
         <w:t>Interpretation:</w:t>
       </w:r>
       <w:r>
@@ -781,9 +748,6 @@
         <w:pStyle w:val="ListBullet"/>
       </w:pPr>
       <w:r>
-        <w:rPr>
-          <w:b/>
-        </w:rPr>
         <w:t>Recommendation:</w:t>
       </w:r>
       <w:r>
@@ -795,9 +759,6 @@
         <w:pStyle w:val="ListBullet"/>
       </w:pPr>
       <w:r>
-        <w:rPr>
-          <w:b/>
-        </w:rPr>
         <w:t>Verification:</w:t>
       </w:r>
       <w:r>
@@ -809,9 +770,6 @@
         <w:pStyle w:val="ListBullet"/>
       </w:pPr>
       <w:r>
-        <w:rPr>
-          <w:b/>
-        </w:rPr>
         <w:t>Limitation:</w:t>
       </w:r>
       <w:r>
@@ -831,9 +789,6 @@
         <w:pStyle w:val="ListBullet"/>
       </w:pPr>
       <w:r>
-        <w:rPr>
-          <w:b/>
-        </w:rPr>
         <w:t>Evidence:</w:t>
       </w:r>
       <w:r>
@@ -845,9 +800,6 @@
         <w:pStyle w:val="ListBullet"/>
       </w:pPr>
       <w:r>
-        <w:rPr>
-          <w:b/>
-        </w:rPr>
         <w:t>Interpretation:</w:t>
       </w:r>
       <w:r>
@@ -859,9 +811,6 @@
         <w:pStyle w:val="ListBullet"/>
       </w:pPr>
       <w:r>
-        <w:rPr>
-          <w:b/>
-        </w:rPr>
         <w:t>Recommendation:</w:t>
       </w:r>
       <w:r>
@@ -873,9 +822,6 @@
         <w:pStyle w:val="ListBullet"/>
       </w:pPr>
       <w:r>
-        <w:rPr>
-          <w:b/>
-        </w:rPr>
         <w:t>Verification:</w:t>
       </w:r>
       <w:r>
@@ -907,9 +853,6 @@
         <w:pStyle w:val="ListBullet"/>
       </w:pPr>
       <w:r>
-        <w:rPr>
-          <w:b/>
-        </w:rPr>
         <w:t>Limitation:</w:t>
       </w:r>
       <w:r>
@@ -929,9 +872,6 @@
         <w:pStyle w:val="ListBullet"/>
       </w:pPr>
       <w:r>
-        <w:rPr>
-          <w:b/>
-        </w:rPr>
         <w:t>Evidence:</w:t>
       </w:r>
       <w:r>
@@ -943,9 +883,6 @@
         <w:pStyle w:val="ListBullet"/>
       </w:pPr>
       <w:r>
-        <w:rPr>
-          <w:b/>
-        </w:rPr>
         <w:t>Interpretation:</w:t>
       </w:r>
       <w:r>
@@ -957,9 +894,6 @@
         <w:pStyle w:val="ListBullet"/>
       </w:pPr>
       <w:r>
-        <w:rPr>
-          <w:b/>
-        </w:rPr>
         <w:t>Recommendation:</w:t>
       </w:r>
       <w:r>
@@ -971,9 +905,6 @@
         <w:pStyle w:val="ListBullet"/>
       </w:pPr>
       <w:r>
-        <w:rPr>
-          <w:b/>
-        </w:rPr>
         <w:t>Verification:</w:t>
       </w:r>
       <w:r>
@@ -985,9 +916,6 @@
         <w:pStyle w:val="ListBullet"/>
       </w:pPr>
       <w:r>
-        <w:rPr>
-          <w:b/>
-        </w:rPr>
         <w:t>Limitation:</w:t>
       </w:r>
       <w:r>
@@ -1004,9 +932,6 @@
     </w:p>
     <w:p>
       <w:r>
-        <w:rPr>
-          <w:b/>
-        </w:rPr>
         <w:t>Focused question asked of the AI system:</w:t>
       </w:r>
       <w:r>
@@ -1015,9 +940,6 @@
     </w:p>
     <w:p>
       <w:r>
-        <w:rPr>
-          <w:b/>
-        </w:rPr>
         <w:t>Generated answer summary:</w:t>
       </w:r>
       <w:r>
@@ -1326,9 +1248,6 @@
     </w:p>
     <w:p>
       <w:r>
-        <w:rPr>
-          <w:b/>
-        </w:rPr>
         <w:t>Updated prototype:</w:t>
       </w:r>
       <w:r>
@@ -1340,9 +1259,6 @@
         <w:pStyle w:val="ListNumber"/>
       </w:pPr>
       <w:r>
-        <w:rPr>
-          <w:b/>
-        </w:rPr>
         <w:t>Search-intent improvement</w:t>
       </w:r>
     </w:p>
@@ -1351,9 +1267,6 @@
         <w:pStyle w:val="ListBullet"/>
       </w:pPr>
       <w:r>
-        <w:rPr>
-          <w:b/>
-        </w:rPr>
         <w:t>Before:</w:t>
       </w:r>
       <w:r>
@@ -1365,9 +1278,6 @@
         <w:pStyle w:val="ListBullet"/>
       </w:pPr>
       <w:r>
-        <w:rPr>
-          <w:b/>
-        </w:rPr>
         <w:t>After:</w:t>
       </w:r>
       <w:r>
@@ -1379,9 +1289,6 @@
         <w:pStyle w:val="ListNumber"/>
       </w:pPr>
       <w:r>
-        <w:rPr>
-          <w:b/>
-        </w:rPr>
         <w:t>Source-identity improvement</w:t>
       </w:r>
     </w:p>
@@ -1390,9 +1297,6 @@
         <w:pStyle w:val="ListBullet"/>
       </w:pPr>
       <w:r>
-        <w:rPr>
-          <w:b/>
-        </w:rPr>
         <w:t>Before:</w:t>
       </w:r>
       <w:r>
@@ -1404,9 +1308,6 @@
         <w:pStyle w:val="ListBullet"/>
       </w:pPr>
       <w:r>
-        <w:rPr>
-          <w:b/>
-        </w:rPr>
         <w:t>After:</w:t>
       </w:r>
       <w:r>

</xml_diff>

<commit_message>
Remove Word theme colors from Lab 4 report
</commit_message>
<xml_diff>
--- a/output/CGT390_Lab4_SEO_GEO_Page_Audit.docx
+++ b/output/CGT390_Lab4_SEO_GEO_Page_Audit.docx
@@ -8,6 +8,10 @@
         <w:jc w:val="left"/>
       </w:pPr>
       <w:r>
+        <w:rPr>
+          <w:rFonts w:ascii="Times New Roman" w:hAnsi="Times New Roman"/>
+          <w:color w:val="000000"/>
+        </w:rPr>
         <w:t>CGT 390 Lab 4 SEO GEO Page Audit</w:t>
       </w:r>
     </w:p>
@@ -16,6 +20,10 @@
         <w:pStyle w:val="Heading1"/>
       </w:pPr>
       <w:r>
+        <w:rPr>
+          <w:rFonts w:ascii="Times New Roman" w:hAnsi="Times New Roman"/>
+          <w:color w:val="000000"/>
+        </w:rPr>
         <w:t>Page and search need</w:t>
       </w:r>
     </w:p>
@@ -96,6 +104,10 @@
         <w:pStyle w:val="Heading1"/>
       </w:pPr>
       <w:r>
+        <w:rPr>
+          <w:rFonts w:ascii="Times New Roman" w:hAnsi="Times New Roman"/>
+          <w:color w:val="000000"/>
+        </w:rPr>
         <w:t>Audit evidence</w:t>
       </w:r>
     </w:p>
@@ -676,6 +688,10 @@
         <w:pStyle w:val="Heading1"/>
       </w:pPr>
       <w:r>
+        <w:rPr>
+          <w:rFonts w:ascii="Times New Roman" w:hAnsi="Times New Roman"/>
+          <w:color w:val="000000"/>
+        </w:rPr>
         <w:t>Part 4 Two questions to answer</w:t>
       </w:r>
     </w:p>
@@ -710,6 +726,10 @@
         <w:pStyle w:val="Heading1"/>
       </w:pPr>
       <w:r>
+        <w:rPr>
+          <w:rFonts w:ascii="Times New Roman" w:hAnsi="Times New Roman"/>
+          <w:color w:val="000000"/>
+        </w:rPr>
         <w:t>Findings and evidence-to-verification records</w:t>
       </w:r>
     </w:p>
@@ -718,6 +738,10 @@
         <w:pStyle w:val="Heading2"/>
       </w:pPr>
       <w:r>
+        <w:rPr>
+          <w:rFonts w:ascii="Times New Roman" w:hAnsi="Times New Roman"/>
+          <w:color w:val="000000"/>
+        </w:rPr>
         <w:t>Finding 1 Search intent was too vague in metadata and headings</w:t>
       </w:r>
     </w:p>
@@ -781,6 +805,10 @@
         <w:pStyle w:val="Heading2"/>
       </w:pPr>
       <w:r>
+        <w:rPr>
+          <w:rFonts w:ascii="Times New Roman" w:hAnsi="Times New Roman"/>
+          <w:color w:val="000000"/>
+        </w:rPr>
         <w:t>Finding 2 The page lacked explicit machine-readable page identity</w:t>
       </w:r>
     </w:p>
@@ -864,6 +892,10 @@
         <w:pStyle w:val="Heading2"/>
       </w:pPr>
       <w:r>
+        <w:rPr>
+          <w:rFonts w:ascii="Times New Roman" w:hAnsi="Times New Roman"/>
+          <w:color w:val="000000"/>
+        </w:rPr>
         <w:t>Finding 3 The page provides useful comparison facts but not real availability</w:t>
       </w:r>
     </w:p>
@@ -927,6 +959,10 @@
         <w:pStyle w:val="Heading1"/>
       </w:pPr>
       <w:r>
+        <w:rPr>
+          <w:rFonts w:ascii="Times New Roman" w:hAnsi="Times New Roman"/>
+          <w:color w:val="000000"/>
+        </w:rPr>
         <w:t>Part 5 Generated-answer check</w:t>
       </w:r>
     </w:p>
@@ -1214,6 +1250,10 @@
         <w:pStyle w:val="Heading1"/>
       </w:pPr>
       <w:r>
+        <w:rPr>
+          <w:rFonts w:ascii="Times New Roman" w:hAnsi="Times New Roman"/>
+          <w:color w:val="000000"/>
+        </w:rPr>
         <w:t>Part 6 Priorities and Part 7 Prototype implementation</w:t>
       </w:r>
     </w:p>
@@ -1243,6 +1283,10 @@
         <w:pStyle w:val="Heading1"/>
       </w:pPr>
       <w:r>
+        <w:rPr>
+          <w:rFonts w:ascii="Times New Roman" w:hAnsi="Times New Roman"/>
+          <w:color w:val="000000"/>
+        </w:rPr>
         <w:t>Before-and-after evidence</w:t>
       </w:r>
     </w:p>
@@ -1319,6 +1363,10 @@
         <w:pStyle w:val="Heading1"/>
       </w:pPr>
       <w:r>
+        <w:rPr>
+          <w:rFonts w:ascii="Times New Roman" w:hAnsi="Times New Roman"/>
+          <w:color w:val="000000"/>
+        </w:rPr>
         <w:t>Immediate validation and later measurement plan</w:t>
       </w:r>
     </w:p>
@@ -1417,6 +1465,10 @@
         <w:pStyle w:val="Heading1"/>
       </w:pPr>
       <w:r>
+        <w:rPr>
+          <w:rFonts w:ascii="Times New Roman" w:hAnsi="Times New Roman"/>
+          <w:color w:val="000000"/>
+        </w:rPr>
         <w:t>AI-use statement</w:t>
       </w:r>
     </w:p>
@@ -1435,6 +1487,10 @@
         <w:pStyle w:val="Heading1"/>
       </w:pPr>
       <w:r>
+        <w:rPr>
+          <w:rFonts w:ascii="Times New Roman" w:hAnsi="Times New Roman"/>
+          <w:color w:val="000000"/>
+        </w:rPr>
         <w:t>Brief presentation summary</w:t>
       </w:r>
     </w:p>
@@ -2184,9 +2240,6 @@
     <w:qFormat/>
     <w:rsid w:val="00FC693F"/>
     <w:pPr>
-      <w:pBdr>
-        <w:bottom w:val="single" w:sz="8" w:space="4" w:color="4F81BD" w:themeColor="accent1"/>
-      </w:pBdr>
       <w:spacing w:after="300" w:line="240" w:lineRule="auto"/>
       <w:contextualSpacing/>
     </w:pPr>

</xml_diff>

<commit_message>
Fix escaped separator in audit table
</commit_message>
<xml_diff>
--- a/output/CGT390_Lab4_SEO_GEO_Page_Audit.docx
+++ b/output/CGT390_Lab4_SEO_GEO_Page_Audit.docx
@@ -333,7 +333,7 @@
               <w:rPr>
                 <w:sz w:val="17"/>
               </w:rPr>
-              <w:t>Before the revision, the title was “Explore events \\</w:t>
+              <w:t>Before the revision, the title was “Explore events - Gatherly,” the description was generic, and the H1 was “Explore events.” The page content did not name creative workshops or local events in its primary metadata or heading.</w:t>
             </w:r>
           </w:p>
         </w:tc>
@@ -358,7 +358,7 @@
               <w:rPr>
                 <w:sz w:val="17"/>
               </w:rPr>
-              <w:t>Gatherly,” the description was generic, and the H1 was “Explore events.” The page content did not name creative workshops or local events in its primary metadata or heading.</w:t>
+              <w:t>A searcher using the likely query would receive too little context from the result title and snippet.</w:t>
             </w:r>
           </w:p>
         </w:tc>
@@ -381,12 +381,6 @@
             <w:pPr>
               <w:spacing w:after="40"/>
             </w:pPr>
-            <w:r>
-              <w:rPr>
-                <w:sz w:val="17"/>
-              </w:rPr>
-              <w:t>A searcher using the likely query would receive too little context from the result title and snippet.</w:t>
-            </w:r>
             <w:r>
               <w:rPr>
                 <w:sz w:val="17"/>

</xml_diff>

<commit_message>
Clarify human and AI contributions in Lab 4
</commit_message>
<xml_diff>
--- a/output/CGT390_Lab4_SEO_GEO_Page_Audit.docx
+++ b/output/CGT390_Lab4_SEO_GEO_Page_Audit.docx
@@ -1468,12 +1468,12 @@
     </w:p>
     <w:p>
       <w:r>
-        <w:t>AI supported this lab as a research, writing, and implementation assistant. It helped identify audit evidence in the existing Gatherly files, organize the findings, suggest clearer metadata and structured-data improvements, update the Explore page, and check the deployed page after the changes were published. It also helped organize the evidence and validation results into this report.</w:t>
+        <w:t>I, the human designer, chose the Explore Events page, collected the page and project data, reviewed the suggested findings, and selected the two improvements used in this audit. After the updates were deployed, I reviewed the live page, confirmed that the changes fit the page content and user task, and tested the search behavior.</w:t>
       </w:r>
     </w:p>
     <w:p>
       <w:r>
-        <w:t>Human direction remained responsible for the important decisions. I selected Gatherly as the case-study prototype, chose the Explore Events page, defined the intended user and likely search query, and decided which user task the audit should prioritize. I reviewed the suggested changes and limited the implementation to two improvements that fit the page: clearer search intent and stronger page identity. I also chose to keep the event data fictional, avoided claiming real availability or rankings, and rejected unsupported SEO additions. After implementation, I reviewed the deployed page, confirmed that the title, H1, metadata, canonical URL, and structured data matched the visible content, and tested the event search behavior. The AI helped carry out and document these steps, but the scope, judgment, fact-checking, and final decisions remained human-directed.</w:t>
+        <w:t>AI handled the time-consuming production work. It helped build and update the website, add the revised page title, description, H1, canonical URL, and structured data, check the deployed page, and write this document from the draft and direction I provided. AI also helped organize the evidence, findings, validation results, and presentation summary into a finished submission.</w:t>
       </w:r>
     </w:p>
     <w:p>

</xml_diff>